<commit_message>
Add fix with all_sum
</commit_message>
<xml_diff>
--- a/experiments/app-v1/templates/claim.docx
+++ b/experiments/app-v1/templates/claim.docx
@@ -4009,7 +4009,7 @@
           <w:shd w:fill="auto" w:val="clear"/>
           <w:vertAlign w:val="baseline"/>
         </w:rPr>
-        <w:t>по Договору № 05.403297-ТЭ от 01.08.2017:</w:t>
+        <w:t>по Договору 05.403297-ТЭ от 01.08.2017:</w:t>
       </w:r>
     </w:p>
     <w:p>
@@ -4285,47 +4285,7 @@
           <w:shd w:fill="auto" w:val="clear"/>
           <w:vertAlign w:val="baseline"/>
         </w:rPr>
-        <w:t xml:space="preserve">неустойку по день фактического исполнения обязательства, начиная с </w:t>
-      </w:r>
-      <w:r>
-        <w:rPr>
-          <w:rFonts w:eastAsia="Times New Roman" w:cs="Times New Roman" w:ascii="Times New Roman" w:hAnsi="Times New Roman"/>
-          <w:b w:val="false"/>
-          <w:i w:val="false"/>
-          <w:caps w:val="false"/>
-          <w:smallCaps w:val="false"/>
-          <w:strike w:val="false"/>
-          <w:dstrike w:val="false"/>
-          <w:color w:val="000000"/>
-          <w:position w:val="0"/>
-          <w:sz w:val="24"/>
-          <w:sz w:val="24"/>
-          <w:szCs w:val="24"/>
-          <w:u w:val="none"/>
-          <w:shd w:fill="auto" w:val="clear"/>
-          <w:vertAlign w:val="baseline"/>
-        </w:rPr>
-        <w:t xml:space="preserve"> /*начальная дата неустойки*/</w:t>
-      </w:r>
-      <w:r>
-        <w:rPr>
-          <w:rFonts w:eastAsia="Times New Roman" w:cs="Times New Roman" w:ascii="Times New Roman" w:hAnsi="Times New Roman"/>
-          <w:b w:val="false"/>
-          <w:i w:val="false"/>
-          <w:caps w:val="false"/>
-          <w:smallCaps w:val="false"/>
-          <w:strike w:val="false"/>
-          <w:dstrike w:val="false"/>
-          <w:color w:val="000000"/>
-          <w:position w:val="0"/>
-          <w:sz w:val="24"/>
-          <w:sz w:val="24"/>
-          <w:szCs w:val="24"/>
-          <w:u w:val="none"/>
-          <w:shd w:fill="auto" w:val="clear"/>
-          <w:vertAlign w:val="baseline"/>
-        </w:rPr>
-        <w:t xml:space="preserve"> года, рассчитанную исходя из 1/130 ставки рефинансирования Банка России;</w:t>
+        <w:t>неустойку по день фактического исполнения обязательства, начиная с  /*начальная дата неустойки*/ года, рассчитанную исходя из 1/130 ставки рефинансирования Банка России;</w:t>
       </w:r>
     </w:p>
     <w:p>

</xml_diff>